<commit_message>
change AI to form
</commit_message>
<xml_diff>
--- a/templates/storyline_template.docx
+++ b/templates/storyline_template.docx
@@ -4,20 +4,28 @@
   <w:body>
     <w:p>
       <w:pPr>
+        <w:pStyle w:val="MetaLabel"/>
+        <w:jc w:val="center"/>
+        <w:spacing w:after="80"/>
+      </w:pPr>
+      <w:r>
+        <w:rPr>
+          <w:b/>
+          <w:bCs/>
+          <w:color w:val="6B7280"/>
+          <w:sz w:val="18"/>
+          <w:szCs w:val="18"/>
+        </w:rPr>
+        <w:t>TikTok : francfoil</w:t>
+      </w:r>
+    </w:p>
+    <w:p>
+      <w:pPr>
         <w:pStyle w:val="Title"/>
         <w:jc w:val="center"/>
       </w:pPr>
       <w:r>
         <w:t>{{TITLE}}</w:t>
-      </w:r>
-    </w:p>
-    <w:p>
-      <w:pPr>
-        <w:pStyle w:val="Subtitle"/>
-        <w:jc w:val="center"/>
-      </w:pPr>
-      <w:r>
-        <w:t>{{SUBTITLE}}</w:t>
       </w:r>
     </w:p>
     <w:p>
@@ -26,12 +34,14 @@
         <w:pBdr>
           <w:bottom w:val="single" w:sz="8" w:space="6" w:color="4B5563"/>
         </w:pBdr>
-        <w:spacing w:after="260"/>
+        <w:spacing w:before="0" w:after="120"/>
       </w:pPr>
       <w:r>
         <w:t xml:space="preserve"> </w:t>
       </w:r>
     </w:p>
+{{OPTIONAL_DRESS_CODE}}
+{{OPTIONAL_VIBE}}
     <w:tbl>
       <w:tblPr>
         <w:tblW w:w="9026" w:type="dxa"/>
@@ -137,38 +147,8 @@
         <w:t xml:space="preserve"> </w:t>
       </w:r>
     </w:p>
-    <w:p>
-      <w:pPr>
-        <w:pStyle w:val="MetaLabel"/>
-      </w:pPr>
-      <w:r>
-        <w:t>CTA</w:t>
-      </w:r>
-    </w:p>
-    <w:p>
-      <w:pPr>
-        <w:spacing w:after="160"/>
-      </w:pPr>
-      <w:r>
-        <w:t>{{CTA}}</w:t>
-      </w:r>
-    </w:p>
-    <w:p>
-      <w:pPr>
-        <w:pStyle w:val="MetaLabel"/>
-      </w:pPr>
-      <w:r>
-        <w:t>CAPTION IDEA</w:t>
-      </w:r>
-    </w:p>
-    <w:p>
-      <w:pPr>
-        <w:spacing w:after="0"/>
-      </w:pPr>
-      <w:r>
-        <w:t>{{CAPTION_IDEA}}</w:t>
-      </w:r>
-    </w:p>
+{{OPTIONAL_CTA}}
+{{OPTIONAL_CAPTION}}
     <w:sectPr>
       <w:pgSz w:w="11906" w:h="16838"/>
       <w:pgMar w:top="1440" w:right="1440" w:bottom="1440" w:left="1440" w:header="708" w:footer="708" w:gutter="0"/>
@@ -194,7 +174,7 @@
     <w:basedOn w:val="Normal"/>
     <w:qFormat/>
     <w:pPr>
-      <w:spacing w:after="120"/>
+      <w:spacing w:after="60"/>
     </w:pPr>
     <w:rPr>
       <w:b/>
@@ -202,21 +182,6 @@
       <w:color w:val="111827"/>
       <w:sz w:val="32"/>
       <w:szCs w:val="32"/>
-    </w:rPr>
-  </w:style>
-  <w:style w:type="paragraph" w:styleId="Subtitle">
-    <w:name w:val="Subtitle"/>
-    <w:basedOn w:val="Normal"/>
-    <w:qFormat/>
-    <w:pPr>
-      <w:spacing w:after="200"/>
-    </w:pPr>
-    <w:rPr>
-      <w:b/>
-      <w:bCs/>
-      <w:color w:val="111827"/>
-      <w:sz w:val="28"/>
-      <w:szCs w:val="28"/>
     </w:rPr>
   </w:style>
   <w:style w:type="paragraph" w:styleId="MetaLabel">

</xml_diff>